<commit_message>
Fix two inconsistencies found in the call-for-evidence response audit
Audited the response's findings/recommendations against the model outputs; all
headline numbers reconcile (Q2.1 1.26x/2.21x; Q2.2 +£208m/+£2m/+£226m; Q2.3
20%->11%, +969 jobs; Q2.4 p90 14.4->7.9%; Q2.5 70->97%; Q2.6 0.86->2.21x; Q2.7
36%/£639m). Two issues fixed:

1. Q2.2 "roughly ten times" understated the evidence: community benefit unlocks
   ~122x the next-best single lever (finance +£1.7m) and planning/skills/energy
   unlock nothing. Reworded to give the actual figures (+£208m vs <£2m vs nil) in
   the response, EXECUTIVE_SUMMARY and NI_MINERALS_MODEL_REPORT.
2. Q2.7 response table omitted the "do nothing" baseline (£653m net) that the
   "below doing nothing" finding is measured against — added the baseline row and
   tied the text to it (£639m < £653m).

Regenerated all Word docs.

Co-Authored-By: Claude Opus 4.8 <noreply@anthropic.com>
</commit_message>
<xml_diff>
--- a/word/Executive_Summary.docx
+++ b/word/Executive_Summary.docx
@@ -365,21 +365,26 @@
     </w:p>
     <w:p>
       <w:r>
-        <w:t xml:space="preserve">forward — and it delivers roughly </w:t>
+        <w:t xml:space="preserve">forward — and it is </w:t>
       </w:r>
       <w:r>
         <w:rPr>
           <w:b/>
         </w:rPr>
-        <w:t>ten times</w:t>
-      </w:r>
-      <w:r>
-        <w:t xml:space="preserve"> the value of finance, permitting</w:t>
+        <w:t>by far the most powerful single lever</w:t>
+      </w:r>
+      <w:r>
+        <w:t xml:space="preserve"> (+£208m discounted</w:t>
       </w:r>
     </w:p>
     <w:p>
       <w:r>
-        <w:t>or skills support on their own (+£208m discounted GVA, +~600 jobs). Crucially it</w:t>
+        <w:t>GVA and +~600 jobs, versus under £2m for the next-best lever, finance, and nothing</w:t>
+      </w:r>
+    </w:p>
+    <w:p>
+      <w:r>
+        <w:t>for permitting, skills or energy on their own). Crucially it</w:t>
       </w:r>
     </w:p>
     <w:p>
@@ -1265,7 +1270,7 @@
         <w:pStyle w:val="Heading2"/>
       </w:pPr>
       <w:r>
-        <w:t>Six recommendations</w:t>
+        <w:t>Recommendations from the findings</w:t>
       </w:r>
     </w:p>
     <w:p>
@@ -1276,20 +1281,20 @@
         <w:rPr>
           <w:b/>
         </w:rPr>
-        <w:t>Build the midstream.</w:t>
-      </w:r>
-      <w:r>
-        <w:t xml:space="preserve"> Fund first-of-a-kind / scale-up processing and recovery</w:t>
+        <w:t>Because collection is the immediate bottleneck, fix feedstock first.</w:t>
+      </w:r>
+      <w:r>
+        <w:t xml:space="preserve"> Build</w:t>
       </w:r>
     </w:p>
     <w:p>
       <w:r>
-        <w:t>capacity (cost-share + blended finance + offtake/price floor). This is the binding</w:t>
+        <w:t>take-back and collection routes for batteries, electronics, magnets, end-of-life</w:t>
       </w:r>
     </w:p>
     <w:p>
       <w:r>
-        <w:t>gap and the highest-leverage action.</w:t>
+        <w:t>vehicle parts and industrial scrap before relying on plant grants.</w:t>
       </w:r>
     </w:p>
     <w:p>
@@ -1297,18 +1302,17 @@
         <w:pStyle w:val="ListNumber"/>
       </w:pPr>
       <w:r>
-        <w:rPr>
-          <w:b/>
-        </w:rPr>
-        <w:t>Fix feedstock collection.</w:t>
-      </w:r>
-      <w:r>
-        <w:t xml:space="preserve"> A smart collection / deposit-return / WEEE scheme is</w:t>
+        <w:t>**Because design rules give the best value for money, start with low-cost market</w:t>
       </w:r>
     </w:p>
     <w:p>
       <w:r>
-        <w:t>the only route to the 20% recycling target.</w:t>
+        <w:t>rules.** Use recycled-content procurement, design-for-recycling standards and</w:t>
+      </w:r>
+    </w:p>
+    <w:p>
+      <w:r>
+        <w:t>product passports to create demand for recovered material.</w:t>
       </w:r>
     </w:p>
     <w:p>
@@ -1319,20 +1323,17 @@
         <w:rPr>
           <w:b/>
         </w:rPr>
-        <w:t>Lead with cheap demand-side rules.</w:t>
-      </w:r>
-      <w:r>
-        <w:t xml:space="preserve"> Recycled-content procurement, ecodesign</w:t>
+        <w:t>Because NI's gap is the missing middle, build processing and recovery capacity.</w:t>
       </w:r>
     </w:p>
     <w:p>
       <w:r>
-        <w:t>standards and product passports — high return, low cost — sequenced ahead of, then</w:t>
+        <w:t>Help first commercial plants with cost-sharing, guarantees and long-term purchase</w:t>
       </w:r>
     </w:p>
     <w:p>
       <w:r>
-        <w:t>alongside, capacity.</w:t>
+        <w:t>contracts.</w:t>
       </w:r>
     </w:p>
     <w:p>
@@ -1340,28 +1341,17 @@
         <w:pStyle w:val="ListNumber"/>
       </w:pPr>
       <w:r>
-        <w:rPr>
-          <w:b/>
-        </w:rPr>
-        <w:t>Make any extraction responsible and contained.</w:t>
-      </w:r>
-      <w:r>
-        <w:t xml:space="preserve"> Pair primary development with a</w:t>
+        <w:t>**Because community acceptance is the binding constraint for extraction, make local</w:t>
       </w:r>
     </w:p>
     <w:p>
       <w:r>
-        <w:t>genuine community-benefit scheme (the binding constraint), high-ESG design (which</w:t>
+        <w:t>benefit a gateway.** Require credible community-benefit agreements, local jobs,</w:t>
       </w:r>
     </w:p>
     <w:p>
       <w:r>
-        <w:t>cuts the local burden ~35%) and bonded closure; impacts are site-specific, so</w:t>
-      </w:r>
-    </w:p>
-    <w:p>
-      <w:r>
-        <w:t>require project- and place-specific assessment.</w:t>
+        <w:t>high standards and clean-up bonds before supporting new mining.</w:t>
       </w:r>
     </w:p>
     <w:p>
@@ -1369,23 +1359,17 @@
         <w:pStyle w:val="ListNumber"/>
       </w:pPr>
       <w:r>
-        <w:rPr>
-          <w:b/>
-        </w:rPr>
-        <w:t>Tie support to local content and skills.</w:t>
-      </w:r>
-      <w:r>
-        <w:t xml:space="preserve"> Local-supplier development plus a</w:t>
+        <w:t>**Because manufacturer support does little without material supply, sequence</w:t>
       </w:r>
     </w:p>
     <w:p>
       <w:r>
-        <w:t>green-skills / apprenticeship pipeline convert headline jobs into *retained* NI jobs</w:t>
+        <w:t>business support.** Support processors first, then manufacturers, with one DfE-led</w:t>
       </w:r>
     </w:p>
     <w:p>
       <w:r>
-        <w:t>(~70%→~97%) and are the gating enabler of the GVA and employment benefits.</w:t>
+        <w:t>front door for strategic projects.</w:t>
       </w:r>
     </w:p>
     <w:p>
@@ -1393,23 +1377,61 @@
         <w:pStyle w:val="ListNumber"/>
       </w:pPr>
       <w:r>
+        <w:t>**Because supply security is under-provided by the market, act as co-ordinator and</w:t>
+      </w:r>
+    </w:p>
+    <w:p>
+      <w:r>
+        <w:t>insurer.** Monitor risk, diversify suppliers, hold a modest reserve and treat</w:t>
+      </w:r>
+    </w:p>
+    <w:p>
+      <w:r>
+        <w:t>processing capacity as a security asset.</w:t>
+      </w:r>
+    </w:p>
+    <w:p>
+      <w:pPr>
+        <w:pStyle w:val="ListNumber"/>
+      </w:pPr>
+      <w:r>
+        <w:t>**Because retained jobs are a policy choice, tie support to local content and</w:t>
+      </w:r>
+    </w:p>
+    <w:p>
+      <w:r>
+        <w:t>skills.** Public support should come with apprenticeships, training places, NI</w:t>
+      </w:r>
+    </w:p>
+    <w:p>
+      <w:r>
+        <w:t>supplier commitments and reporting on jobs kept in NI.</w:t>
+      </w:r>
+    </w:p>
+    <w:p>
+      <w:pPr>
+        <w:pStyle w:val="ListNumber"/>
+      </w:pPr>
+      <w:r>
         <w:rPr>
           <w:b/>
         </w:rPr>
-        <w:t>Create one front door and a thin safety net.</w:t>
-      </w:r>
-      <w:r>
-        <w:t xml:space="preserve"> A single "strategic project"</w:t>
+        <w:t>Because the economic case is strongest as a package, appraise the portfolio.</w:t>
       </w:r>
     </w:p>
     <w:p>
       <w:r>
-        <w:t>designation (mirroring/accessing EU CRMA via Windsor) plus a modest ~180-day</w:t>
+        <w:t>Count GVA, tax, exports, avoided imports and manufacturer resilience, while also</w:t>
       </w:r>
     </w:p>
     <w:p>
       <w:r>
-        <w:t>strategic reserve and international diversification for the residual risk.</w:t>
+        <w:t>subtracting leakage, closure liabilities, displaced farming/tourism and stranded</w:t>
+      </w:r>
+    </w:p>
+    <w:p>
+      <w:r>
+        <w:t>capital risk.</w:t>
       </w:r>
     </w:p>
     <w:p>

</xml_diff>